<commit_message>
Report: clickable repository link, names on cover
</commit_message>
<xml_diff>
--- a/report/Academic_Helpdesk_Agent_Report.docx
+++ b/report/Academic_Helpdesk_Agent_Report.docx
@@ -103,231 +103,40 @@
         <w:t xml:space="preserve">Submitted by</w:t>
       </w:r>
     </w:p>
-    <w:tbl>
-      <w:tblPr>
-        <w:tblW w:type="dxa" w:w="5200"/>
+    <w:p>
+      <w:pPr>
+        <w:spacing w:after="80"/>
         <w:jc w:val="center"/>
-        <w:tblBorders>
-          <w:top w:val="single" w:color="auto" w:sz="4"/>
-          <w:left w:val="single" w:color="auto" w:sz="4"/>
-          <w:bottom w:val="single" w:color="auto" w:sz="4"/>
-          <w:right w:val="single" w:color="auto" w:sz="4"/>
-          <w:insideH w:val="single" w:color="auto" w:sz="4"/>
-          <w:insideV w:val="single" w:color="auto" w:sz="4"/>
-        </w:tblBorders>
-        <w:tblLayout w:type="fixed"/>
-      </w:tblPr>
-      <w:tblGrid>
-        <w:gridCol w:w="3200"/>
-        <w:gridCol w:w="2000"/>
-      </w:tblGrid>
-      <w:tr>
-        <w:tc>
-          <w:tcPr>
-            <w:tcW w:type="dxa" w:w="3200"/>
-            <w:tcBorders>
-              <w:top w:val="single" w:color="BFC8D2" w:sz="4"/>
-              <w:left w:val="single" w:color="BFC8D2" w:sz="4"/>
-              <w:bottom w:val="single" w:color="BFC8D2" w:sz="4"/>
-              <w:right w:val="single" w:color="BFC8D2" w:sz="4"/>
-            </w:tcBorders>
-            <w:shd w:fill="DCE6F2" w:color="auto" w:val="clear"/>
-            <w:tcMar>
-              <w:top w:type="dxa" w:w="80"/>
-              <w:left w:type="dxa" w:w="120"/>
-              <w:bottom w:type="dxa" w:w="80"/>
-              <w:right w:type="dxa" w:w="120"/>
-            </w:tcMar>
-          </w:tcPr>
-          <w:p>
-            <w:pPr>
-              <w:jc w:val="center"/>
-            </w:pPr>
-            <w:r>
-              <w:rPr>
-                <w:rFonts w:ascii="Calibri" w:cs="Calibri" w:eastAsia="Calibri" w:hAnsi="Calibri"/>
-                <w:b/>
-                <w:bCs/>
-                <w:color w:val="1F2933"/>
-                <w:sz w:val="22"/>
-                <w:szCs w:val="22"/>
-              </w:rPr>
-              <w:t xml:space="preserve">Name</w:t>
-            </w:r>
-          </w:p>
-        </w:tc>
-        <w:tc>
-          <w:tcPr>
-            <w:tcW w:type="dxa" w:w="2000"/>
-            <w:tcBorders>
-              <w:top w:val="single" w:color="BFC8D2" w:sz="4"/>
-              <w:left w:val="single" w:color="BFC8D2" w:sz="4"/>
-              <w:bottom w:val="single" w:color="BFC8D2" w:sz="4"/>
-              <w:right w:val="single" w:color="BFC8D2" w:sz="4"/>
-            </w:tcBorders>
-            <w:shd w:fill="DCE6F2" w:color="auto" w:val="clear"/>
-            <w:tcMar>
-              <w:top w:type="dxa" w:w="80"/>
-              <w:left w:type="dxa" w:w="120"/>
-              <w:bottom w:type="dxa" w:w="80"/>
-              <w:right w:type="dxa" w:w="120"/>
-            </w:tcMar>
-          </w:tcPr>
-          <w:p>
-            <w:pPr>
-              <w:jc w:val="center"/>
-            </w:pPr>
-            <w:r>
-              <w:rPr>
-                <w:rFonts w:ascii="Calibri" w:cs="Calibri" w:eastAsia="Calibri" w:hAnsi="Calibri"/>
-                <w:b/>
-                <w:bCs/>
-                <w:color w:val="1F2933"/>
-                <w:sz w:val="22"/>
-                <w:szCs w:val="22"/>
-              </w:rPr>
-              <w:t xml:space="preserve">Roll number</w:t>
-            </w:r>
-          </w:p>
-        </w:tc>
-      </w:tr>
-      <w:tr>
-        <w:tc>
-          <w:tcPr>
-            <w:tcW w:type="dxa" w:w="3200"/>
-            <w:tcBorders>
-              <w:top w:val="single" w:color="BFC8D2" w:sz="4"/>
-              <w:left w:val="single" w:color="BFC8D2" w:sz="4"/>
-              <w:bottom w:val="single" w:color="BFC8D2" w:sz="4"/>
-              <w:right w:val="single" w:color="BFC8D2" w:sz="4"/>
-            </w:tcBorders>
-            <w:tcMar>
-              <w:top w:type="dxa" w:w="80"/>
-              <w:left w:type="dxa" w:w="120"/>
-              <w:bottom w:type="dxa" w:w="80"/>
-              <w:right w:type="dxa" w:w="120"/>
-            </w:tcMar>
-          </w:tcPr>
-          <w:p>
-            <w:pPr>
-              <w:jc w:val="center"/>
-            </w:pPr>
-            <w:r>
-              <w:rPr>
-                <w:rFonts w:ascii="Calibri" w:cs="Calibri" w:eastAsia="Calibri" w:hAnsi="Calibri"/>
-                <w:b w:val="false"/>
-                <w:bCs w:val="false"/>
-                <w:color w:val="1F2933"/>
-                <w:sz w:val="22"/>
-                <w:szCs w:val="22"/>
-              </w:rPr>
-              <w:t xml:space="preserve">ANSHIKA ROLYA</w:t>
-            </w:r>
-          </w:p>
-        </w:tc>
-        <w:tc>
-          <w:tcPr>
-            <w:tcW w:type="dxa" w:w="2000"/>
-            <w:tcBorders>
-              <w:top w:val="single" w:color="BFC8D2" w:sz="4"/>
-              <w:left w:val="single" w:color="BFC8D2" w:sz="4"/>
-              <w:bottom w:val="single" w:color="BFC8D2" w:sz="4"/>
-              <w:right w:val="single" w:color="BFC8D2" w:sz="4"/>
-            </w:tcBorders>
-            <w:tcMar>
-              <w:top w:type="dxa" w:w="80"/>
-              <w:left w:type="dxa" w:w="120"/>
-              <w:bottom w:type="dxa" w:w="80"/>
-              <w:right w:type="dxa" w:w="120"/>
-            </w:tcMar>
-          </w:tcPr>
-          <w:p>
-            <w:pPr>
-              <w:jc w:val="center"/>
-            </w:pPr>
-            <w:r>
-              <w:rPr>
-                <w:rFonts w:ascii="Calibri" w:cs="Calibri" w:eastAsia="Calibri" w:hAnsi="Calibri"/>
-                <w:b w:val="false"/>
-                <w:bCs w:val="false"/>
-                <w:color w:val="1F2933"/>
-                <w:sz w:val="22"/>
-                <w:szCs w:val="22"/>
-              </w:rPr>
-              <w:t xml:space="preserve">B23CH1003</w:t>
-            </w:r>
-          </w:p>
-        </w:tc>
-      </w:tr>
-      <w:tr>
-        <w:tc>
-          <w:tcPr>
-            <w:tcW w:type="dxa" w:w="3200"/>
-            <w:tcBorders>
-              <w:top w:val="single" w:color="BFC8D2" w:sz="4"/>
-              <w:left w:val="single" w:color="BFC8D2" w:sz="4"/>
-              <w:bottom w:val="single" w:color="BFC8D2" w:sz="4"/>
-              <w:right w:val="single" w:color="BFC8D2" w:sz="4"/>
-            </w:tcBorders>
-            <w:tcMar>
-              <w:top w:type="dxa" w:w="80"/>
-              <w:left w:type="dxa" w:w="120"/>
-              <w:bottom w:type="dxa" w:w="80"/>
-              <w:right w:type="dxa" w:w="120"/>
-            </w:tcMar>
-          </w:tcPr>
-          <w:p>
-            <w:pPr>
-              <w:jc w:val="center"/>
-            </w:pPr>
-            <w:r>
-              <w:rPr>
-                <w:rFonts w:ascii="Calibri" w:cs="Calibri" w:eastAsia="Calibri" w:hAnsi="Calibri"/>
-                <w:b w:val="false"/>
-                <w:bCs w:val="false"/>
-                <w:color w:val="1F2933"/>
-                <w:sz w:val="22"/>
-                <w:szCs w:val="22"/>
-              </w:rPr>
-              <w:t xml:space="preserve">BRUNDHA DEVI A</w:t>
-            </w:r>
-          </w:p>
-        </w:tc>
-        <w:tc>
-          <w:tcPr>
-            <w:tcW w:type="dxa" w:w="2000"/>
-            <w:tcBorders>
-              <w:top w:val="single" w:color="BFC8D2" w:sz="4"/>
-              <w:left w:val="single" w:color="BFC8D2" w:sz="4"/>
-              <w:bottom w:val="single" w:color="BFC8D2" w:sz="4"/>
-              <w:right w:val="single" w:color="BFC8D2" w:sz="4"/>
-            </w:tcBorders>
-            <w:tcMar>
-              <w:top w:type="dxa" w:w="80"/>
-              <w:left w:type="dxa" w:w="120"/>
-              <w:bottom w:type="dxa" w:w="80"/>
-              <w:right w:type="dxa" w:w="120"/>
-            </w:tcMar>
-          </w:tcPr>
-          <w:p>
-            <w:pPr>
-              <w:jc w:val="center"/>
-            </w:pPr>
-            <w:r>
-              <w:rPr>
-                <w:rFonts w:ascii="Calibri" w:cs="Calibri" w:eastAsia="Calibri" w:hAnsi="Calibri"/>
-                <w:b w:val="false"/>
-                <w:bCs w:val="false"/>
-                <w:color w:val="1F2933"/>
-                <w:sz w:val="22"/>
-                <w:szCs w:val="22"/>
-              </w:rPr>
-              <w:t xml:space="preserve">B23CH1015</w:t>
-            </w:r>
-          </w:p>
-        </w:tc>
-      </w:tr>
-    </w:tbl>
+      </w:pPr>
+      <w:r>
+        <w:rPr>
+          <w:rFonts w:ascii="Calibri" w:cs="Calibri" w:eastAsia="Calibri" w:hAnsi="Calibri"/>
+          <w:b/>
+          <w:bCs/>
+          <w:color w:val="1F2933"/>
+          <w:sz w:val="24"/>
+          <w:szCs w:val="24"/>
+        </w:rPr>
+        <w:t xml:space="preserve">ANSHIKA ROLYA (B23CH1003)</w:t>
+      </w:r>
+    </w:p>
+    <w:p>
+      <w:pPr>
+        <w:spacing w:after="80"/>
+        <w:jc w:val="center"/>
+      </w:pPr>
+      <w:r>
+        <w:rPr>
+          <w:rFonts w:ascii="Calibri" w:cs="Calibri" w:eastAsia="Calibri" w:hAnsi="Calibri"/>
+          <w:b/>
+          <w:bCs/>
+          <w:color w:val="1F2933"/>
+          <w:sz w:val="24"/>
+          <w:szCs w:val="24"/>
+        </w:rPr>
+        <w:t xml:space="preserve">BRUNDHA DEVI A (B23CH1015)</w:t>
+      </w:r>
+    </w:p>
     <w:p>
       <w:pPr>
         <w:spacing w:before="900"/>
@@ -355,8 +164,20 @@
           <w:sz w:val="20"/>
           <w:szCs w:val="20"/>
         </w:rPr>
-        <w:t xml:space="preserve">Code repository: github.com/brundhaiitj/AS_A2_Acadamic-Helpdesk-Agent_1015_1003</w:t>
+        <w:t xml:space="preserve">Code repository: </w:t>
       </w:r>
+      <w:hyperlink w:history="1" r:id="rId7blxor5nkjiashnodyds_">
+        <w:r>
+          <w:rPr>
+            <w:rFonts w:ascii="Calibri" w:cs="Calibri" w:eastAsia="Calibri" w:hAnsi="Calibri"/>
+            <w:color w:val="1155CC"/>
+            <w:sz w:val="20"/>
+            <w:szCs w:val="20"/>
+            <w:u w:val="single"/>
+          </w:rPr>
+          <w:t xml:space="preserve">https://github.com/brundhaiitj/AS_A2_Acadamic-Helpdesk-Agent_1015_1003</w:t>
+        </w:r>
+      </w:hyperlink>
     </w:p>
     <w:p>
       <w:r>
@@ -19141,6 +18962,32 @@
         </w:rPr>
         <w:t xml:space="preserve">13. Code repository and how to run</w:t>
       </w:r>
+    </w:p>
+    <w:p>
+      <w:pPr>
+        <w:spacing w:after="120"/>
+      </w:pPr>
+      <w:r>
+        <w:rPr>
+          <w:rFonts w:ascii="Calibri" w:cs="Calibri" w:eastAsia="Calibri" w:hAnsi="Calibri"/>
+          <w:color w:val="1F2933"/>
+          <w:sz w:val="21"/>
+          <w:szCs w:val="21"/>
+        </w:rPr>
+        <w:t xml:space="preserve">Repository: </w:t>
+      </w:r>
+      <w:hyperlink w:history="1" r:id="rIdli-ojldpywkyeuthxgai3">
+        <w:r>
+          <w:rPr>
+            <w:rFonts w:ascii="Calibri" w:cs="Calibri" w:eastAsia="Calibri" w:hAnsi="Calibri"/>
+            <w:color w:val="1155CC"/>
+            <w:sz w:val="21"/>
+            <w:szCs w:val="21"/>
+            <w:u w:val="single"/>
+          </w:rPr>
+          <w:t xml:space="preserve">https://github.com/brundhaiitj/AS_A2_Acadamic-Helpdesk-Agent_1015_1003</w:t>
+        </w:r>
+      </w:hyperlink>
     </w:p>
     <w:tbl>
       <w:tblPr>

</xml_diff>